<commit_message>
Overleg Kevin: alleen de grote beslissingen
Details eruit die de coordinerend onderzoeker zelf regelt: slidenummers, laptop en
IT-rechten, kalibratielog, EuroQol.

Toegevoegd: de keuze tussen de twee eCRF-sets. Er liggen nog 47 S71769-bestanden
naast de werkset, en punt 17 op de tijdlijn staat nog op niet indieningsklaar.
Zonder keuze vertrekt de centrale indiening niet. Ook toegevoegd: of de Go/No-Go
in februari nog haalbaar is.

Gecorrigeerd: de deadline voor de eigenaar van de procesevaluatie is september en
nog niet verstreken. REDCap wacht niet alleen op de freeze maar ook op de velden
van WP2 en WP3.

Co-Authored-By: Claude Opus 5.5 <noreply@anthropic.com>
</commit_message>
<xml_diff>
--- a/PARADISE_overleg_Kevin_Deschamps.docx
+++ b/PARADISE_overleg_Kevin_Deschamps.docx
@@ -23,9 +23,9 @@
         <w:rPr>
           <w:b/>
           <w:color w:val="00407A"/>
-          <w:sz w:val="30"/>
+          <w:sz w:val="32"/>
         </w:rPr>
-        <w:t>Overleg Kevin Deschamps — vervolg, planning, eigenaarschap</w:t>
+        <w:t>Overleg Kevin Deschamps</w:t>
       </w:r>
     </w:p>
     <w:p>
@@ -38,12 +38,12 @@
           <w:color w:val="5A6A78"/>
           <w:sz w:val="18"/>
         </w:rPr>
-        <w:t>24 september 2026</w:t>
+        <w:t>24 september 2026  ·  vervolg, planning, eigenaarschap</w:t>
       </w:r>
     </w:p>
     <w:p>
       <w:pPr>
-        <w:spacing w:before="200" w:after="60"/>
+        <w:spacing w:before="240" w:after="80"/>
       </w:pPr>
       <w:r>
         <w:rPr>
@@ -51,12 +51,12 @@
           <w:color w:val="FF7A00"/>
           <w:sz w:val="22"/>
         </w:rPr>
-        <w:t>Klaar</w:t>
+        <w:t>Stand</w:t>
       </w:r>
     </w:p>
     <w:p>
       <w:pPr>
-        <w:spacing w:after="60"/>
+        <w:spacing w:after="100"/>
         <w:ind w:left="340" w:hanging="340"/>
       </w:pPr>
       <w:r>
@@ -73,7 +73,7 @@
           <w:color w:val="1B2630"/>
           <w:sz w:val="20"/>
         </w:rPr>
-        <w:t>REDCap gebouwd</w:t>
+        <w:t>REDCap is gebouwd</w:t>
       </w:r>
       <w:r>
         <w:rPr>
@@ -81,34 +81,12 @@
           <w:color w:val="5A6A78"/>
           <w:sz w:val="20"/>
         </w:rPr>
-        <w:t xml:space="preserve">  — 1 413 velden, 205 koppelingen; bewust in Development tot de eCRF’s vastliggen</w:t>
+        <w:t xml:space="preserve">  — wacht op de eCRF-freeze en de velden van WP2 en WP3</w:t>
       </w:r>
     </w:p>
     <w:p>
       <w:pPr>
-        <w:spacing w:after="60"/>
-        <w:ind w:left="340" w:hanging="340"/>
-      </w:pPr>
-      <w:r>
-        <w:rPr>
-          <w:b/>
-          <w:color w:val="FF7A00"/>
-          <w:sz w:val="20"/>
-        </w:rPr>
-        <w:t xml:space="preserve">✓  </w:t>
-      </w:r>
-      <w:r>
-        <w:rPr>
-          <w:b/>
-          <w:color w:val="1B2630"/>
-          <w:sz w:val="20"/>
-        </w:rPr>
-        <w:t>EuroQol geregistreerd; licentieplan vragenlijsten klaar</w:t>
-      </w:r>
-    </w:p>
-    <w:p>
-      <w:pPr>
-        <w:spacing w:before="200" w:after="60"/>
+        <w:spacing w:before="240" w:after="80"/>
       </w:pPr>
       <w:r>
         <w:rPr>
@@ -116,12 +94,12 @@
           <w:color w:val="FF7A00"/>
           <w:sz w:val="22"/>
         </w:rPr>
-        <w:t>Vandaag beslissen — en wie het trekt</w:t>
+        <w:t>Te beslissen</w:t>
       </w:r>
     </w:p>
     <w:p>
       <w:pPr>
-        <w:spacing w:after="60"/>
+        <w:spacing w:after="100"/>
         <w:ind w:left="340" w:hanging="340"/>
       </w:pPr>
       <w:r>
@@ -138,7 +116,7 @@
           <w:color w:val="1B2630"/>
           <w:sz w:val="20"/>
         </w:rPr>
-        <w:t>Website: houden of niet?</w:t>
+        <w:t>Is de Go/No-Go in februari nog haalbaar?</w:t>
       </w:r>
       <w:r>
         <w:rPr>
@@ -146,12 +124,12 @@
           <w:color w:val="5A6A78"/>
           <w:sz w:val="20"/>
         </w:rPr>
-        <w:t xml:space="preserve">  — voorstel: publieke pagina’s naar KU Leuven (.kuleuven.be, gratis), ledenportaal eruit. Wie onderhoudt?</w:t>
+        <w:t xml:space="preserve">  — centrale indiening okt, lokaal binnen 30 dagen, opleiding, droogloop, piloot. Opleidingen in november of december? De planning en de centra krijgen nu elk een andere datum</w:t>
       </w:r>
     </w:p>
     <w:p>
       <w:pPr>
-        <w:spacing w:after="60"/>
+        <w:spacing w:after="100"/>
         <w:ind w:left="340" w:hanging="340"/>
       </w:pPr>
       <w:r>
@@ -168,7 +146,7 @@
           <w:color w:val="1B2630"/>
           <w:sz w:val="20"/>
         </w:rPr>
-        <w:t>Opleidingsplanning vastleggen</w:t>
+        <w:t>Welke eCRF-set is de officiële?</w:t>
       </w:r>
       <w:r>
         <w:rPr>
@@ -176,12 +154,12 @@
           <w:color w:val="5A6A78"/>
           <w:sz w:val="20"/>
         </w:rPr>
-        <w:t xml:space="preserve">  — planning zegt november, AZ Groeninge-slides december. Eén datumreeks, ook voor de drooglopen</w:t>
+        <w:t xml:space="preserve">  — er liggen er twee naast elkaar en ze lopen inhoudelijk uiteen. Zonder keuze vertrekt de centrale indiening niet. En wie keurt de freeze goed?</w:t>
       </w:r>
     </w:p>
     <w:p>
       <w:pPr>
-        <w:spacing w:after="60"/>
+        <w:spacing w:after="100"/>
         <w:ind w:left="340" w:hanging="340"/>
       </w:pPr>
       <w:r>
@@ -198,7 +176,7 @@
           <w:color w:val="1B2630"/>
           <w:sz w:val="20"/>
         </w:rPr>
-        <w:t>AZ Groeninge-presentatie afkloppen</w:t>
+        <w:t>Wie draagt WP2 en WP3?</w:t>
       </w:r>
       <w:r>
         <w:rPr>
@@ -206,12 +184,12 @@
           <w:color w:val="5A6A78"/>
           <w:sz w:val="20"/>
         </w:rPr>
-        <w:t xml:space="preserve">  — slide 14 zegt nog “in dezelfde sessie”, maar sinds 22/9 is de referentie de meting zonder zool op V2. Slide 23 volgt punt 2</w:t>
+        <w:t xml:space="preserve">  — eigenaar procesevaluatie (tegen eind september), veldwerk WP2/WP3 (oktober), tweede doctoraatsplaats</w:t>
       </w:r>
     </w:p>
     <w:p>
       <w:pPr>
-        <w:spacing w:after="60"/>
+        <w:spacing w:after="100"/>
         <w:ind w:left="340" w:hanging="340"/>
       </w:pPr>
       <w:r>
@@ -228,7 +206,7 @@
           <w:color w:val="1B2630"/>
           <w:sz w:val="20"/>
         </w:rPr>
-        <w:t>UZ Leuven, installatie 7/10</w:t>
+        <w:t>Novel database: centraal of per centrum?</w:t>
       </w:r>
       <w:r>
         <w:rPr>
@@ -236,12 +214,12 @@
           <w:color w:val="5A6A78"/>
           <w:sz w:val="20"/>
         </w:rPr>
-        <w:t xml:space="preserve">  — vóórdien beslissen: novel database centraal of per centrum (gepland nov, moet nu); laptop en IT-rechten; wie ter plaatse; kalibratielog trublu</w:t>
+        <w:t xml:space="preserve">  — de datastructuur voor zes centra en de GDPR-route. Gepland voor november, maar de eerste installatie is UZ Leuven op 7 oktober</w:t>
       </w:r>
     </w:p>
     <w:p>
       <w:pPr>
-        <w:spacing w:after="60"/>
+        <w:spacing w:after="100"/>
         <w:ind w:left="340" w:hanging="340"/>
       </w:pPr>
       <w:r>
@@ -258,20 +236,12 @@
           <w:color w:val="1B2630"/>
           <w:sz w:val="20"/>
         </w:rPr>
-        <w:t>REDCap: wie keurt de eCRF-freeze goed?</w:t>
-      </w:r>
-      <w:r>
-        <w:rPr>
-          <w:b w:val="0"/>
-          <w:color w:val="5A6A78"/>
-          <w:sz w:val="20"/>
-        </w:rPr>
-        <w:t xml:space="preserve">  — en een harde deadline voor de velden van WP2 en WP3 (nu dec)</w:t>
+        <w:t>Website: houden, naar KU Leuven, of stoppen?</w:t>
       </w:r>
     </w:p>
     <w:p>
       <w:pPr>
-        <w:spacing w:after="60"/>
+        <w:spacing w:after="100"/>
         <w:ind w:left="340" w:hanging="340"/>
       </w:pPr>
       <w:r>
@@ -288,33 +258,12 @@
           <w:color w:val="1B2630"/>
           <w:sz w:val="20"/>
         </w:rPr>
-        <w:t>Eigenaarschap WP2 en WP3</w:t>
-      </w:r>
-      <w:r>
-        <w:rPr>
-          <w:b w:val="0"/>
-          <w:color w:val="5A6A78"/>
-          <w:sz w:val="20"/>
-        </w:rPr>
-        <w:t xml:space="preserve">  — eigenaar procesevaluatie (deadline sep verstreken), veldwerk WP2/WP3 (okt)</w:t>
+        <w:t>Presentatie AZ Groeninge: akkoord?</w:t>
       </w:r>
     </w:p>
     <w:p>
       <w:pPr>
-        <w:spacing w:before="200" w:after="60"/>
-      </w:pPr>
-      <w:r>
-        <w:rPr>
-          <w:b/>
-          <w:color w:val="FF7A00"/>
-          <w:sz w:val="22"/>
-        </w:rPr>
-        <w:t>Kritisch pad oktober</w:t>
-      </w:r>
-    </w:p>
-    <w:p>
-      <w:pPr>
-        <w:spacing w:after="60"/>
+        <w:spacing w:after="100"/>
         <w:ind w:left="340" w:hanging="340"/>
       </w:pPr>
       <w:r>
@@ -323,7 +272,7 @@
           <w:color w:val="FF7A00"/>
           <w:sz w:val="20"/>
         </w:rPr>
-        <w:t xml:space="preserve">•  </w:t>
+        <w:t xml:space="preserve">7  </w:t>
       </w:r>
       <w:r>
         <w:rPr>
@@ -331,78 +280,20 @@
           <w:color w:val="1B2630"/>
           <w:sz w:val="20"/>
         </w:rPr>
-        <w:t>Centrale indiening CTC en FAGG</w:t>
+        <w:t>WP3 uitbreiden met een budgetimpactanalyse?</w:t>
+      </w:r>
+      <w:r>
+        <w:rPr>
+          <w:b w:val="0"/>
+          <w:color w:val="5A6A78"/>
+          <w:sz w:val="20"/>
+        </w:rPr>
+        <w:t xml:space="preserve">  — voorstel aan Koen Putman; nodig voor een terugbetalingsdossier</w:t>
       </w:r>
     </w:p>
     <w:p>
       <w:pPr>
-        <w:spacing w:after="60"/>
-        <w:ind w:left="340" w:hanging="340"/>
-      </w:pPr>
-      <w:r>
-        <w:rPr>
-          <w:b/>
-          <w:color w:val="FF7A00"/>
-          <w:sz w:val="20"/>
-        </w:rPr>
-        <w:t xml:space="preserve">•  </w:t>
-      </w:r>
-      <w:r>
-        <w:rPr>
-          <w:b/>
-          <w:color w:val="1B2630"/>
-          <w:sz w:val="20"/>
-        </w:rPr>
-        <w:t>Registratie ClinicalTrials.gov en BELCRI</w:t>
-      </w:r>
-    </w:p>
-    <w:p>
-      <w:pPr>
-        <w:spacing w:after="60"/>
-        <w:ind w:left="340" w:hanging="340"/>
-      </w:pPr>
-      <w:r>
-        <w:rPr>
-          <w:b/>
-          <w:color w:val="FF7A00"/>
-          <w:sz w:val="20"/>
-        </w:rPr>
-        <w:t xml:space="preserve">•  </w:t>
-      </w:r>
-      <w:r>
-        <w:rPr>
-          <w:b/>
-          <w:color w:val="1B2630"/>
-          <w:sz w:val="20"/>
-        </w:rPr>
-        <w:t>Statistisch analyseplan</w:t>
-      </w:r>
-    </w:p>
-    <w:p>
-      <w:pPr>
-        <w:spacing w:after="60"/>
-        <w:ind w:left="340" w:hanging="340"/>
-      </w:pPr>
-      <w:r>
-        <w:rPr>
-          <w:b/>
-          <w:color w:val="FF7A00"/>
-          <w:sz w:val="20"/>
-        </w:rPr>
-        <w:t xml:space="preserve">•  </w:t>
-      </w:r>
-      <w:r>
-        <w:rPr>
-          <w:b/>
-          <w:color w:val="1B2630"/>
-          <w:sz w:val="20"/>
-        </w:rPr>
-        <w:t>Drukmeetsystemen installeren — UZ Leuven eerst</w:t>
-      </w:r>
-    </w:p>
-    <w:p>
-      <w:pPr>
-        <w:spacing w:before="200" w:after="60"/>
+        <w:spacing w:before="240" w:after="80"/>
       </w:pPr>
       <w:r>
         <w:rPr>
@@ -415,7 +306,7 @@
     </w:p>
     <w:p>
       <w:pPr>
-        <w:spacing w:after="60"/>
+        <w:spacing w:after="100"/>
         <w:ind w:left="340" w:hanging="340"/>
       </w:pPr>
       <w:r>
@@ -440,12 +331,12 @@
           <w:color w:val="5A6A78"/>
           <w:sz w:val="20"/>
         </w:rPr>
-        <w:t xml:space="preserve">  — 40 dagen voor mij tegenover 6 voor jou in dertien weken; tweede doctoraatsplaats open, dus het veldwerk van WP2/WP3 komt bij mij</w:t>
+        <w:t xml:space="preserve">  — 40 dagen voor mij tegenover 6 voor jou in dertien weken; zolang de tweede doctoraatsplaats open is, komt het veldwerk van WP2 en WP3 bij mij</w:t>
       </w:r>
     </w:p>
     <w:p>
       <w:pPr>
-        <w:spacing w:after="60"/>
+        <w:spacing w:after="100"/>
         <w:ind w:left="340" w:hanging="340"/>
       </w:pPr>
       <w:r>
@@ -462,7 +353,7 @@
           <w:color w:val="1B2630"/>
           <w:sz w:val="20"/>
         </w:rPr>
-        <w:t>Beslissingen die bij anderen liggen</w:t>
+        <w:t>Wachten op beslissingen</w:t>
       </w:r>
       <w:r>
         <w:rPr>
@@ -470,12 +361,12 @@
           <w:color w:val="5A6A78"/>
           <w:sz w:val="20"/>
         </w:rPr>
-        <w:t xml:space="preserve">  — eigenaar procesevaluatie, veldwerk, opleidingsdata</w:t>
+        <w:t xml:space="preserve">  — punten 2 tot 4 houden werk tegen</w:t>
       </w:r>
     </w:p>
     <w:p>
       <w:pPr>
-        <w:spacing w:before="200" w:after="60"/>
+        <w:spacing w:before="240" w:after="80"/>
       </w:pPr>
       <w:r>
         <w:rPr>
@@ -488,7 +379,7 @@
     </w:p>
     <w:p>
       <w:pPr>
-        <w:spacing w:after="60"/>
+        <w:spacing w:after="100"/>
         <w:ind w:left="340" w:hanging="340"/>
       </w:pPr>
       <w:r>
@@ -505,7 +396,7 @@
           <w:color w:val="1B2630"/>
           <w:sz w:val="20"/>
         </w:rPr>
-        <w:t>Mandaat: wat mag ik zelf beslissen zonder terugkoppeling?</w:t>
+        <w:t>Mandaat</w:t>
       </w:r>
       <w:r>
         <w:rPr>
@@ -513,12 +404,12 @@
           <w:color w:val="5A6A78"/>
           <w:sz w:val="20"/>
         </w:rPr>
-        <w:t xml:space="preserve">  — bv. eCRF-redactie, SOP-drafts, afspraken met de centra</w:t>
+        <w:t xml:space="preserve">  — wat beslis ik zelf, wat komt bij jou?</w:t>
       </w:r>
     </w:p>
     <w:p>
       <w:pPr>
-        <w:spacing w:after="60"/>
+        <w:spacing w:after="100"/>
         <w:ind w:left="340" w:hanging="340"/>
       </w:pPr>
       <w:r>
@@ -535,12 +426,12 @@
           <w:color w:val="1B2630"/>
           <w:sz w:val="20"/>
         </w:rPr>
-        <w:t>Vast wekelijks halfuur voor beslissingen</w:t>
+        <w:t>Een vast wekelijks halfuur voor beslissingen</w:t>
       </w:r>
     </w:p>
     <w:p>
       <w:pPr>
-        <w:spacing w:after="60"/>
+        <w:spacing w:after="100"/>
         <w:ind w:left="340" w:hanging="340"/>
       </w:pPr>
       <w:r>
@@ -557,12 +448,12 @@
           <w:color w:val="1B2630"/>
           <w:sz w:val="20"/>
         </w:rPr>
-        <w:t>Deadlines voor de co-promotoren, met wat er gebeurt als ze verstrijken</w:t>
+        <w:t>Deadlines voor de co-promotoren, en wat er gebeurt als ze verstrijken</w:t>
       </w:r>
     </w:p>
     <w:sectPr>
       <w:pgSz w:w="12240" w:h="15840"/>
-      <w:pgMar w:top="907" w:right="1134" w:bottom="907" w:left="1134" w:header="720" w:footer="720" w:gutter="0"/>
+      <w:pgMar w:top="1020" w:right="1134" w:bottom="1020" w:left="1134" w:header="720" w:footer="720" w:gutter="0"/>
       <w:cols w:space="720"/>
       <w:docGrid w:linePitch="360"/>
     </w:sectPr>

</xml_diff>